<commit_message>
docs: format references strictly in APA 7th edition with hanging indent
</commit_message>
<xml_diff>
--- a/HO_SO_DU_THI_KHKT_SO_GDDT/BAO_CAO_THUC_HIEN_DU_AN_KHKT_CHINH_THUC.docx
+++ b/HO_SO_DU_THI_KHKT_SO_GDDT/BAO_CAO_THUC_HIEN_DU_AN_KHKT_CHINH_THUC.docx
@@ -2570,22 +2570,6 @@
     </w:p>
     <w:p>
       <w:pPr>
-        <w:spacing w:before="0" w:after="80" w:line="276" w:lineRule="auto"/>
-        <w:jc w:val="both"/>
-      </w:pPr>
-      <w:r>
-        <w:rPr>
-          <w:rFonts w:ascii="Times New Roman" w:hAnsi="Times New Roman"/>
-          <w:b w:val="0"/>
-          <w:i w:val="0"/>
-          <w:color w:val="000000"/>
-          <w:sz w:val="28"/>
-        </w:rPr>
-        <w:t>- Ứng dụng mô hình AI đa phương thức (Multimodal AI) để phân tích chuyển động cơ mặt và vị trí khẩu hình miệng qua camera theo thời gian thực.</w:t>
-      </w:r>
-    </w:p>
-    <w:p>
-      <w:pPr>
         <w:spacing w:before="280" w:after="80" w:line="276" w:lineRule="auto"/>
         <w:jc w:val="left"/>
       </w:pPr>
@@ -2602,7 +2586,24 @@
     </w:p>
     <w:p>
       <w:pPr>
+        <w:spacing w:before="160" w:after="60" w:line="276" w:lineRule="auto"/>
+        <w:jc w:val="left"/>
+      </w:pPr>
+      <w:r>
+        <w:rPr>
+          <w:rFonts w:ascii="Times New Roman" w:hAnsi="Times New Roman"/>
+          <w:b/>
+          <w:i/>
+          <w:color w:val="000000"/>
+          <w:sz w:val="27"/>
+        </w:rPr>
+        <w:t>A. Tài liệu Tiếng Việt:</w:t>
+      </w:r>
+    </w:p>
+    <w:p>
+      <w:pPr>
         <w:spacing w:before="0" w:after="80" w:line="276" w:lineRule="auto"/>
+        <w:ind w:left="576" w:hanging="576"/>
         <w:jc w:val="both"/>
       </w:pPr>
       <w:r>
@@ -2611,14 +2612,35 @@
           <w:b w:val="0"/>
           <w:i w:val="0"/>
           <w:color w:val="000000"/>
-          <w:sz w:val="28"/>
+          <w:sz w:val="26"/>
         </w:rPr>
-        <w:t>1. Bộ Giáo dục và Đào tạo (2018). Chương trình giáo dục phổ thông môn Tiếng Anh (ban hành kèm theo Thông tư số 32/2018/TT-BGDĐT).</w:t>
+        <w:t xml:space="preserve">1. Bộ Giáo dục và Đào tạo. (2018). </w:t>
+      </w:r>
+      <w:r>
+        <w:rPr>
+          <w:rFonts w:ascii="Times New Roman" w:hAnsi="Times New Roman"/>
+          <w:b w:val="0"/>
+          <w:i/>
+          <w:color w:val="000000"/>
+          <w:sz w:val="26"/>
+        </w:rPr>
+        <w:t xml:space="preserve">Chương trình giáo dục phổ thông môn Tiếng Anh </w:t>
+      </w:r>
+      <w:r>
+        <w:rPr>
+          <w:rFonts w:ascii="Times New Roman" w:hAnsi="Times New Roman"/>
+          <w:b w:val="0"/>
+          <w:i w:val="0"/>
+          <w:color w:val="000000"/>
+          <w:sz w:val="26"/>
+        </w:rPr>
+        <w:t>(Ban hành kèm theo Thông tư số 32/2018/TT-BGDĐT ngày 26/12/2018 của Bộ trưởng Bộ Giáo dục và Đào tạo). NXB Giáo dục Việt Nam.</w:t>
       </w:r>
     </w:p>
     <w:p>
       <w:pPr>
         <w:spacing w:before="0" w:after="80" w:line="276" w:lineRule="auto"/>
+        <w:ind w:left="576" w:hanging="576"/>
         <w:jc w:val="both"/>
       </w:pPr>
       <w:r>
@@ -2627,14 +2649,35 @@
           <w:b w:val="0"/>
           <w:i w:val="0"/>
           <w:color w:val="000000"/>
-          <w:sz w:val="28"/>
+          <w:sz w:val="26"/>
         </w:rPr>
-        <w:t>2. Bộ Giáo dục và Đào tạo (2024). Thông tư số 06/2024/TT-BGDĐT ban hành Quy chế Cuộc thi nghiên cứu khoa học, kỹ thuật cấp quốc gia dành cho học sinh trung học.</w:t>
+        <w:t xml:space="preserve">2. Bộ Giáo dục và Đào tạo. (2024). </w:t>
+      </w:r>
+      <w:r>
+        <w:rPr>
+          <w:rFonts w:ascii="Times New Roman" w:hAnsi="Times New Roman"/>
+          <w:b w:val="0"/>
+          <w:i/>
+          <w:color w:val="000000"/>
+          <w:sz w:val="26"/>
+        </w:rPr>
+        <w:t xml:space="preserve">Quy chế Cuộc thi nghiên cứu khoa học, kỹ thuật cấp quốc gia dành cho học sinh trung học cơ sở và trung học phổ thông </w:t>
+      </w:r>
+      <w:r>
+        <w:rPr>
+          <w:rFonts w:ascii="Times New Roman" w:hAnsi="Times New Roman"/>
+          <w:b w:val="0"/>
+          <w:i w:val="0"/>
+          <w:color w:val="000000"/>
+          <w:sz w:val="26"/>
+        </w:rPr>
+        <w:t>(Ban hành kèm theo Thông tư số 06/2024/TT-BGDĐT ngày 10/4/2024 của Bộ trưởng Bộ Giáo dục và Đào tạo).</w:t>
       </w:r>
     </w:p>
     <w:p>
       <w:pPr>
         <w:spacing w:before="0" w:after="80" w:line="276" w:lineRule="auto"/>
+        <w:ind w:left="576" w:hanging="576"/>
         <w:jc w:val="both"/>
       </w:pPr>
       <w:r>
@@ -2643,14 +2686,35 @@
           <w:b w:val="0"/>
           <w:i w:val="0"/>
           <w:color w:val="000000"/>
-          <w:sz w:val="28"/>
+          <w:sz w:val="26"/>
         </w:rPr>
-        <w:t>3. Baker, F. B. (2001). The Basics of Item Response Theory. ERIC Clearinghouse on Assessment and Evaluation, University of Maryland, College Park, MD.</w:t>
+        <w:t xml:space="preserve">3. Hoàng Văn Vân (Tổng Chủ biên), Lương Quỳnh Trang (Chủ biên). (2022). </w:t>
+      </w:r>
+      <w:r>
+        <w:rPr>
+          <w:rFonts w:ascii="Times New Roman" w:hAnsi="Times New Roman"/>
+          <w:b w:val="0"/>
+          <w:i/>
+          <w:color w:val="000000"/>
+          <w:sz w:val="26"/>
+        </w:rPr>
+        <w:t xml:space="preserve">Tiếng Anh 10 - Global Success (Sách học sinh). </w:t>
+      </w:r>
+      <w:r>
+        <w:rPr>
+          <w:rFonts w:ascii="Times New Roman" w:hAnsi="Times New Roman"/>
+          <w:b w:val="0"/>
+          <w:i w:val="0"/>
+          <w:color w:val="000000"/>
+          <w:sz w:val="26"/>
+        </w:rPr>
+        <w:t>NXB Giáo dục Việt Nam.</w:t>
       </w:r>
     </w:p>
     <w:p>
       <w:pPr>
         <w:spacing w:before="0" w:after="80" w:line="276" w:lineRule="auto"/>
+        <w:ind w:left="576" w:hanging="576"/>
         <w:jc w:val="both"/>
       </w:pPr>
       <w:r>
@@ -2659,14 +2723,35 @@
           <w:b w:val="0"/>
           <w:i w:val="0"/>
           <w:color w:val="000000"/>
-          <w:sz w:val="28"/>
+          <w:sz w:val="26"/>
         </w:rPr>
-        <w:t>4. Lord, F. M. (1980). Applications of Item Response Theory to Practical Testing Problems. Lawrence Erlbaum Associates, Hillsdale, NJ.</w:t>
+        <w:t xml:space="preserve">4. Hoàng Văn Vân (Tổng Chủ biên), Phan Hà (Chủ biên). (2023). </w:t>
+      </w:r>
+      <w:r>
+        <w:rPr>
+          <w:rFonts w:ascii="Times New Roman" w:hAnsi="Times New Roman"/>
+          <w:b w:val="0"/>
+          <w:i/>
+          <w:color w:val="000000"/>
+          <w:sz w:val="26"/>
+        </w:rPr>
+        <w:t xml:space="preserve">Tiếng Anh 11 - Global Success (Sách học sinh). </w:t>
+      </w:r>
+      <w:r>
+        <w:rPr>
+          <w:rFonts w:ascii="Times New Roman" w:hAnsi="Times New Roman"/>
+          <w:b w:val="0"/>
+          <w:i w:val="0"/>
+          <w:color w:val="000000"/>
+          <w:sz w:val="26"/>
+        </w:rPr>
+        <w:t>NXB Giáo dục Việt Nam.</w:t>
       </w:r>
     </w:p>
     <w:p>
       <w:pPr>
         <w:spacing w:before="0" w:after="80" w:line="276" w:lineRule="auto"/>
+        <w:ind w:left="576" w:hanging="576"/>
         <w:jc w:val="both"/>
       </w:pPr>
       <w:r>
@@ -2675,14 +2760,35 @@
           <w:b w:val="0"/>
           <w:i w:val="0"/>
           <w:color w:val="000000"/>
-          <w:sz w:val="28"/>
+          <w:sz w:val="26"/>
         </w:rPr>
-        <w:t>5. Wozniak, P. A., &amp; Gorzelanczyk, E. J. (1994). Optimization of repetition spacing in computer-assisted learning. Acta Neurobiologiae Experimentalis, 54(1), 59-62.</w:t>
+        <w:t xml:space="preserve">5. Hoàng Văn Vân (Tổng Chủ biên), Nguyễn Thị Chi (Chủ biên). (2024). </w:t>
+      </w:r>
+      <w:r>
+        <w:rPr>
+          <w:rFonts w:ascii="Times New Roman" w:hAnsi="Times New Roman"/>
+          <w:b w:val="0"/>
+          <w:i/>
+          <w:color w:val="000000"/>
+          <w:sz w:val="26"/>
+        </w:rPr>
+        <w:t xml:space="preserve">Tiếng Anh 12 - Global Success (Sách học sinh). </w:t>
+      </w:r>
+      <w:r>
+        <w:rPr>
+          <w:rFonts w:ascii="Times New Roman" w:hAnsi="Times New Roman"/>
+          <w:b w:val="0"/>
+          <w:i w:val="0"/>
+          <w:color w:val="000000"/>
+          <w:sz w:val="26"/>
+        </w:rPr>
+        <w:t>NXB Giáo dục Việt Nam.</w:t>
       </w:r>
     </w:p>
     <w:p>
       <w:pPr>
         <w:spacing w:before="0" w:after="80" w:line="276" w:lineRule="auto"/>
+        <w:ind w:left="576" w:hanging="576"/>
         <w:jc w:val="both"/>
       </w:pPr>
       <w:r>
@@ -2691,9 +2797,415 @@
           <w:b w:val="0"/>
           <w:i w:val="0"/>
           <w:color w:val="000000"/>
-          <w:sz w:val="28"/>
+          <w:sz w:val="26"/>
         </w:rPr>
-        <w:t>6. Ebbinghaus, H. (1885). Memory: A Contribution to Experimental Psychology. Teachers College, Columbia University, New York.</w:t>
+        <w:t xml:space="preserve">6. Lâm Quang Thiệp. (2012). </w:t>
+      </w:r>
+      <w:r>
+        <w:rPr>
+          <w:rFonts w:ascii="Times New Roman" w:hAnsi="Times New Roman"/>
+          <w:b w:val="0"/>
+          <w:i/>
+          <w:color w:val="000000"/>
+          <w:sz w:val="26"/>
+        </w:rPr>
+        <w:t xml:space="preserve">Đo lường và Đánh giá hoạt động học tập trong nhà trường. </w:t>
+      </w:r>
+      <w:r>
+        <w:rPr>
+          <w:rFonts w:ascii="Times New Roman" w:hAnsi="Times New Roman"/>
+          <w:b w:val="0"/>
+          <w:i w:val="0"/>
+          <w:color w:val="000000"/>
+          <w:sz w:val="26"/>
+        </w:rPr>
+        <w:t>NXB Đại học Quốc gia Hà Nội.</w:t>
+      </w:r>
+    </w:p>
+    <w:p>
+      <w:pPr>
+        <w:spacing w:before="160" w:after="60" w:line="276" w:lineRule="auto"/>
+        <w:jc w:val="left"/>
+      </w:pPr>
+      <w:r>
+        <w:rPr>
+          <w:rFonts w:ascii="Times New Roman" w:hAnsi="Times New Roman"/>
+          <w:b/>
+          <w:i/>
+          <w:color w:val="000000"/>
+          <w:sz w:val="27"/>
+        </w:rPr>
+        <w:t>B. Tài liệu Tiếng Anh (English References - APA 7th Edition):</w:t>
+      </w:r>
+    </w:p>
+    <w:p>
+      <w:pPr>
+        <w:spacing w:before="0" w:after="80" w:line="276" w:lineRule="auto"/>
+        <w:ind w:left="576" w:hanging="576"/>
+        <w:jc w:val="both"/>
+      </w:pPr>
+      <w:r>
+        <w:rPr>
+          <w:rFonts w:ascii="Times New Roman" w:hAnsi="Times New Roman"/>
+          <w:b w:val="0"/>
+          <w:i w:val="0"/>
+          <w:color w:val="000000"/>
+          <w:sz w:val="26"/>
+        </w:rPr>
+        <w:t xml:space="preserve">1. Baker, F. B. (2001). </w:t>
+      </w:r>
+      <w:r>
+        <w:rPr>
+          <w:rFonts w:ascii="Times New Roman" w:hAnsi="Times New Roman"/>
+          <w:b w:val="0"/>
+          <w:i/>
+          <w:color w:val="000000"/>
+          <w:sz w:val="26"/>
+        </w:rPr>
+        <w:t xml:space="preserve">The Basics of Item Response Theory </w:t>
+      </w:r>
+      <w:r>
+        <w:rPr>
+          <w:rFonts w:ascii="Times New Roman" w:hAnsi="Times New Roman"/>
+          <w:b w:val="0"/>
+          <w:i w:val="0"/>
+          <w:color w:val="000000"/>
+          <w:sz w:val="26"/>
+        </w:rPr>
+        <w:t>(2nd ed.). ERIC Clearinghouse on Assessment and Evaluation, University of Maryland.</w:t>
+      </w:r>
+    </w:p>
+    <w:p>
+      <w:pPr>
+        <w:spacing w:before="0" w:after="80" w:line="276" w:lineRule="auto"/>
+        <w:ind w:left="576" w:hanging="576"/>
+        <w:jc w:val="both"/>
+      </w:pPr>
+      <w:r>
+        <w:rPr>
+          <w:rFonts w:ascii="Times New Roman" w:hAnsi="Times New Roman"/>
+          <w:b w:val="0"/>
+          <w:i w:val="0"/>
+          <w:color w:val="000000"/>
+          <w:sz w:val="26"/>
+        </w:rPr>
+        <w:t xml:space="preserve">2. Deng, L., &amp; Li, J. (2013). Machine learning paradigms for speech recognition: An overview. </w:t>
+      </w:r>
+      <w:r>
+        <w:rPr>
+          <w:rFonts w:ascii="Times New Roman" w:hAnsi="Times New Roman"/>
+          <w:b w:val="0"/>
+          <w:i/>
+          <w:color w:val="000000"/>
+          <w:sz w:val="26"/>
+        </w:rPr>
+        <w:t xml:space="preserve">IEEE Transactions on Audio, Speech, and Language Processing, </w:t>
+      </w:r>
+      <w:r>
+        <w:rPr>
+          <w:rFonts w:ascii="Times New Roman" w:hAnsi="Times New Roman"/>
+          <w:b w:val="0"/>
+          <w:i w:val="0"/>
+          <w:color w:val="000000"/>
+          <w:sz w:val="26"/>
+        </w:rPr>
+        <w:t>21(5), 1060–1089. https://doi.org/10.1109/TASL.2013.2244083</w:t>
+      </w:r>
+    </w:p>
+    <w:p>
+      <w:pPr>
+        <w:spacing w:before="0" w:after="80" w:line="276" w:lineRule="auto"/>
+        <w:ind w:left="576" w:hanging="576"/>
+        <w:jc w:val="both"/>
+      </w:pPr>
+      <w:r>
+        <w:rPr>
+          <w:rFonts w:ascii="Times New Roman" w:hAnsi="Times New Roman"/>
+          <w:b w:val="0"/>
+          <w:i w:val="0"/>
+          <w:color w:val="000000"/>
+          <w:sz w:val="26"/>
+        </w:rPr>
+        <w:t xml:space="preserve">3. Ebbinghaus, H. (1885/2013). </w:t>
+      </w:r>
+      <w:r>
+        <w:rPr>
+          <w:rFonts w:ascii="Times New Roman" w:hAnsi="Times New Roman"/>
+          <w:b w:val="0"/>
+          <w:i/>
+          <w:color w:val="000000"/>
+          <w:sz w:val="26"/>
+        </w:rPr>
+        <w:t xml:space="preserve">Memory: A Contribution to Experimental Psychology </w:t>
+      </w:r>
+      <w:r>
+        <w:rPr>
+          <w:rFonts w:ascii="Times New Roman" w:hAnsi="Times New Roman"/>
+          <w:b w:val="0"/>
+          <w:i w:val="0"/>
+          <w:color w:val="000000"/>
+          <w:sz w:val="26"/>
+        </w:rPr>
+        <w:t>(H. A. Ruger &amp; C. E. Bussenius, Trans.). Teachers College, Columbia University.</w:t>
+      </w:r>
+    </w:p>
+    <w:p>
+      <w:pPr>
+        <w:spacing w:before="0" w:after="80" w:line="276" w:lineRule="auto"/>
+        <w:ind w:left="576" w:hanging="576"/>
+        <w:jc w:val="both"/>
+      </w:pPr>
+      <w:r>
+        <w:rPr>
+          <w:rFonts w:ascii="Times New Roman" w:hAnsi="Times New Roman"/>
+          <w:b w:val="0"/>
+          <w:i w:val="0"/>
+          <w:color w:val="000000"/>
+          <w:sz w:val="26"/>
+        </w:rPr>
+        <w:t xml:space="preserve">4. Embretson, S. E., &amp; Reise, S. P. (2000). </w:t>
+      </w:r>
+      <w:r>
+        <w:rPr>
+          <w:rFonts w:ascii="Times New Roman" w:hAnsi="Times New Roman"/>
+          <w:b w:val="0"/>
+          <w:i/>
+          <w:color w:val="000000"/>
+          <w:sz w:val="26"/>
+        </w:rPr>
+        <w:t xml:space="preserve">Item Response Theory for Psychologists. </w:t>
+      </w:r>
+      <w:r>
+        <w:rPr>
+          <w:rFonts w:ascii="Times New Roman" w:hAnsi="Times New Roman"/>
+          <w:b w:val="0"/>
+          <w:i w:val="0"/>
+          <w:color w:val="000000"/>
+          <w:sz w:val="26"/>
+        </w:rPr>
+        <w:t>Lawrence Erlbaum Associates Publishers.</w:t>
+      </w:r>
+    </w:p>
+    <w:p>
+      <w:pPr>
+        <w:spacing w:before="0" w:after="80" w:line="276" w:lineRule="auto"/>
+        <w:ind w:left="576" w:hanging="576"/>
+        <w:jc w:val="both"/>
+      </w:pPr>
+      <w:r>
+        <w:rPr>
+          <w:rFonts w:ascii="Times New Roman" w:hAnsi="Times New Roman"/>
+          <w:b w:val="0"/>
+          <w:i w:val="0"/>
+          <w:color w:val="000000"/>
+          <w:sz w:val="26"/>
+        </w:rPr>
+        <w:t xml:space="preserve">5. Levis, J. M. (2018). </w:t>
+      </w:r>
+      <w:r>
+        <w:rPr>
+          <w:rFonts w:ascii="Times New Roman" w:hAnsi="Times New Roman"/>
+          <w:b w:val="0"/>
+          <w:i/>
+          <w:color w:val="000000"/>
+          <w:sz w:val="26"/>
+        </w:rPr>
+        <w:t xml:space="preserve">Intelligibility, Oral Communication, and the Teaching of Pronunciation. </w:t>
+      </w:r>
+      <w:r>
+        <w:rPr>
+          <w:rFonts w:ascii="Times New Roman" w:hAnsi="Times New Roman"/>
+          <w:b w:val="0"/>
+          <w:i w:val="0"/>
+          <w:color w:val="000000"/>
+          <w:sz w:val="26"/>
+        </w:rPr>
+        <w:t>Cambridge University Press. https://doi.org/10.1017/9781108241564</w:t>
+      </w:r>
+    </w:p>
+    <w:p>
+      <w:pPr>
+        <w:spacing w:before="0" w:after="80" w:line="276" w:lineRule="auto"/>
+        <w:ind w:left="576" w:hanging="576"/>
+        <w:jc w:val="both"/>
+      </w:pPr>
+      <w:r>
+        <w:rPr>
+          <w:rFonts w:ascii="Times New Roman" w:hAnsi="Times New Roman"/>
+          <w:b w:val="0"/>
+          <w:i w:val="0"/>
+          <w:color w:val="000000"/>
+          <w:sz w:val="26"/>
+        </w:rPr>
+        <w:t xml:space="preserve">6. Lord, F. M. (1980). </w:t>
+      </w:r>
+      <w:r>
+        <w:rPr>
+          <w:rFonts w:ascii="Times New Roman" w:hAnsi="Times New Roman"/>
+          <w:b w:val="0"/>
+          <w:i/>
+          <w:color w:val="000000"/>
+          <w:sz w:val="26"/>
+        </w:rPr>
+        <w:t xml:space="preserve">Applications of Item Response Theory to Practical Testing Problems. </w:t>
+      </w:r>
+      <w:r>
+        <w:rPr>
+          <w:rFonts w:ascii="Times New Roman" w:hAnsi="Times New Roman"/>
+          <w:b w:val="0"/>
+          <w:i w:val="0"/>
+          <w:color w:val="000000"/>
+          <w:sz w:val="26"/>
+        </w:rPr>
+        <w:t>Lawrence Erlbaum Associates.</w:t>
+      </w:r>
+    </w:p>
+    <w:p>
+      <w:pPr>
+        <w:spacing w:before="0" w:after="80" w:line="276" w:lineRule="auto"/>
+        <w:ind w:left="576" w:hanging="576"/>
+        <w:jc w:val="both"/>
+      </w:pPr>
+      <w:r>
+        <w:rPr>
+          <w:rFonts w:ascii="Times New Roman" w:hAnsi="Times New Roman"/>
+          <w:b w:val="0"/>
+          <w:i w:val="0"/>
+          <w:color w:val="000000"/>
+          <w:sz w:val="26"/>
+        </w:rPr>
+        <w:t xml:space="preserve">7. Luckin, R., Holmes, W., Griffiths, M., &amp; Forcier, L. B. (2016). </w:t>
+      </w:r>
+      <w:r>
+        <w:rPr>
+          <w:rFonts w:ascii="Times New Roman" w:hAnsi="Times New Roman"/>
+          <w:b w:val="0"/>
+          <w:i/>
+          <w:color w:val="000000"/>
+          <w:sz w:val="26"/>
+        </w:rPr>
+        <w:t xml:space="preserve">Intelligence Unleashed: An argument for AI in Education. </w:t>
+      </w:r>
+      <w:r>
+        <w:rPr>
+          <w:rFonts w:ascii="Times New Roman" w:hAnsi="Times New Roman"/>
+          <w:b w:val="0"/>
+          <w:i w:val="0"/>
+          <w:color w:val="000000"/>
+          <w:sz w:val="26"/>
+        </w:rPr>
+        <w:t>Pearson Education.</w:t>
+      </w:r>
+    </w:p>
+    <w:p>
+      <w:pPr>
+        <w:spacing w:before="0" w:after="80" w:line="276" w:lineRule="auto"/>
+        <w:ind w:left="576" w:hanging="576"/>
+        <w:jc w:val="both"/>
+      </w:pPr>
+      <w:r>
+        <w:rPr>
+          <w:rFonts w:ascii="Times New Roman" w:hAnsi="Times New Roman"/>
+          <w:b w:val="0"/>
+          <w:i w:val="0"/>
+          <w:color w:val="000000"/>
+          <w:sz w:val="26"/>
+        </w:rPr>
+        <w:t xml:space="preserve">8. UNESCO. (2023). </w:t>
+      </w:r>
+      <w:r>
+        <w:rPr>
+          <w:rFonts w:ascii="Times New Roman" w:hAnsi="Times New Roman"/>
+          <w:b w:val="0"/>
+          <w:i/>
+          <w:color w:val="000000"/>
+          <w:sz w:val="26"/>
+        </w:rPr>
+        <w:t xml:space="preserve">Guidance for Generative AI in Education and Research. </w:t>
+      </w:r>
+      <w:r>
+        <w:rPr>
+          <w:rFonts w:ascii="Times New Roman" w:hAnsi="Times New Roman"/>
+          <w:b w:val="0"/>
+          <w:i w:val="0"/>
+          <w:color w:val="000000"/>
+          <w:sz w:val="26"/>
+        </w:rPr>
+        <w:t>United Nations Educational, Scientific and Cultural Organization.</w:t>
+      </w:r>
+    </w:p>
+    <w:p>
+      <w:pPr>
+        <w:spacing w:before="0" w:after="80" w:line="276" w:lineRule="auto"/>
+        <w:ind w:left="576" w:hanging="576"/>
+        <w:jc w:val="both"/>
+      </w:pPr>
+      <w:r>
+        <w:rPr>
+          <w:rFonts w:ascii="Times New Roman" w:hAnsi="Times New Roman"/>
+          <w:b w:val="0"/>
+          <w:i w:val="0"/>
+          <w:color w:val="000000"/>
+          <w:sz w:val="26"/>
+        </w:rPr>
+        <w:t xml:space="preserve">9. Vanlehn, K. (2011). The relative effectiveness of human tutoring, intelligent tutoring systems, and other tutoring systems. </w:t>
+      </w:r>
+      <w:r>
+        <w:rPr>
+          <w:rFonts w:ascii="Times New Roman" w:hAnsi="Times New Roman"/>
+          <w:b w:val="0"/>
+          <w:i/>
+          <w:color w:val="000000"/>
+          <w:sz w:val="26"/>
+        </w:rPr>
+        <w:t xml:space="preserve">Educational Psychologist, </w:t>
+      </w:r>
+      <w:r>
+        <w:rPr>
+          <w:rFonts w:ascii="Times New Roman" w:hAnsi="Times New Roman"/>
+          <w:b w:val="0"/>
+          <w:i w:val="0"/>
+          <w:color w:val="000000"/>
+          <w:sz w:val="26"/>
+        </w:rPr>
+        <w:t>46(4), 197–221. https://doi.org/10.1080/00461520.2011.614136</w:t>
+      </w:r>
+    </w:p>
+    <w:p>
+      <w:pPr>
+        <w:spacing w:before="0" w:after="80" w:line="276" w:lineRule="auto"/>
+        <w:ind w:left="576" w:hanging="576"/>
+        <w:jc w:val="both"/>
+      </w:pPr>
+      <w:r>
+        <w:rPr>
+          <w:rFonts w:ascii="Times New Roman" w:hAnsi="Times New Roman"/>
+          <w:b w:val="0"/>
+          <w:i w:val="0"/>
+          <w:color w:val="000000"/>
+          <w:sz w:val="26"/>
+        </w:rPr>
+        <w:t xml:space="preserve">10. Wozniak, P. A., &amp; Gorzelanczyk, E. J. (1994). Optimization of repetition spacing in computer-assisted learning. </w:t>
+      </w:r>
+      <w:r>
+        <w:rPr>
+          <w:rFonts w:ascii="Times New Roman" w:hAnsi="Times New Roman"/>
+          <w:b w:val="0"/>
+          <w:i/>
+          <w:color w:val="000000"/>
+          <w:sz w:val="26"/>
+        </w:rPr>
+        <w:t xml:space="preserve">Acta Neurobiologiae Experimentalis, </w:t>
+      </w:r>
+      <w:r>
+        <w:rPr>
+          <w:rFonts w:ascii="Times New Roman" w:hAnsi="Times New Roman"/>
+          <w:b w:val="0"/>
+          <w:i w:val="0"/>
+          <w:color w:val="000000"/>
+          <w:sz w:val="26"/>
+        </w:rPr>
+        <w:t>54(1), 59–62.</w:t>
       </w:r>
     </w:p>
     <w:sectPr>

</xml_diff>